<commit_message>
Sandy & Junior: ajustes da Parte 2
Co-Authored-By: Claude Opus 5.5 <noreply@anthropic.com>
Claude-Session: https://claude.ai/code/session_01MJjUEEZrxQDEUifKK2vj9g
</commit_message>
<xml_diff>
--- a/roteiros/sandy-junior/SJ_Parte2.docx
+++ b/roteiros/sandy-junior/SJ_Parte2.docx
@@ -39,7 +39,7 @@
         <w:rPr>
           <w:color w:val="000000"/>
         </w:rPr>
-        <w:t>De segunda a sexta, eram alunos do colégio de freiras em Campinas. Nos fins de semana, eram uma empresa.</w:t>
+        <w:t>De segunda a sexta, eram alunos do colégio de freiras em Campinas. Nos fins de semana, viajavam para shows.</w:t>
       </w:r>
     </w:p>
     <w:p>
@@ -47,7 +47,7 @@
         <w:rPr>
           <w:color w:val="000000"/>
         </w:rPr>
-        <w:t>Shows em ginásios, programas de auditório, sessões de fotos, entrevistas. Viagens de uma cidade para outra enquanto os colegas de sala brincavam na rua.</w:t>
+        <w:t>Ginásios lotados e programas de auditório. Viagens de uma cidade para outra enquanto os colegas de sala brincavam na rua.</w:t>
       </w:r>
     </w:p>
     <w:p>
@@ -63,7 +63,7 @@
         <w:rPr>
           <w:color w:val="000000"/>
         </w:rPr>
-        <w:t>Do lado de dentro, as regras eram outras. Cada aparição tinha horário marcado. Cada sorriso era fotografado. Cada palavra podia virar manchete no dia seguinte.</w:t>
+        <w:t>Do lado de dentro, as regras eram outras. Cada aparição tinha horário marcado. Cada palavra podia virar manchete no dia seguinte.</w:t>
       </w:r>
     </w:p>
     <w:p>
@@ -95,7 +95,7 @@
         <w:rPr>
           <w:color w:val="C00000"/>
         </w:rPr>
-        <w:t>Imagine por um momento que fosse com o seu filho. Uma criança de doze anos, levada para um programa de televisão, e mandada embora pela porta dos fundos na frente de todo mundo. Foi o que aconteceu com Sandy e Junior. E o pai deles nunca esqueceu.</w:t>
+        <w:t>Imagine por um momento que fosse com o seu filho. Uma criança levada para um programa de televisão e mandada embora antes de cantar. Foi o que aconteceu com Sandy e Junior. E o pai deles nunca esqueceu.</w:t>
       </w:r>
     </w:p>
     <w:p>
@@ -215,7 +215,7 @@
         <w:rPr>
           <w:color w:val="000000"/>
         </w:rPr>
-        <w:t>Era uma menina tímida, romântica, que ainda nem tinha namorado. Já fazia sucesso em todo o Brasil e dava entrevistas como se fosse adulta.</w:t>
+        <w:t>Era uma menina romântica, que ainda nem tinha namorado. Já fazia sucesso em todo o Brasil e dava entrevistas como se fosse adulta.</w:t>
       </w:r>
     </w:p>
     <w:p>
@@ -223,7 +223,7 @@
         <w:rPr>
           <w:color w:val="000000"/>
         </w:rPr>
-        <w:t>Naquele ano, ela foi entrevistada pelo Fantástico, o programa de domingo mais assistido do país.</w:t>
+        <w:t>Naquela época, ela foi entrevistada pelo Fantástico, a revista eletrônica de domingo da Globo.</w:t>
       </w:r>
     </w:p>
     <w:p>
@@ -279,7 +279,7 @@
         <w:rPr>
           <w:color w:val="C00000"/>
         </w:rPr>
-        <w:t>Talvez você esteja pensando que já descobriu qual dos dois irmãos sofria em silêncio. Guarde essa conclusão por enquanto. Porque o que aconteceu com Sandy depois dessa entrevista foi cruel. Mas não é o segredo que separou os dois.</w:t>
+        <w:t>Talvez você esteja pensando que já descobriu qual dos dois irmãos sofria em silêncio. Guarde essa conclusão por enquanto. O que aconteceu com Sandy depois dessa entrevista foi cruel. E o segredo que separou os dois ainda está escondido mais à frente.</w:t>
       </w:r>
     </w:p>
     <w:p>
@@ -303,7 +303,7 @@
         <w:rPr>
           <w:color w:val="000000"/>
         </w:rPr>
-        <w:t>Em programas de auditório, em revistas, em entrevistas coletivas. A vida íntima de uma adolescente virou assunto de interesse nacional.</w:t>
+        <w:t>Em programas de auditório e em revistas. A vida íntima de uma adolescente virou assunto de interesse nacional.</w:t>
       </w:r>
     </w:p>
     <w:p>
@@ -311,7 +311,7 @@
         <w:rPr>
           <w:color w:val="000000"/>
         </w:rPr>
-        <w:t>Anos depois, Sandy contaria que se sentia vigiada, cobrada e julgada o tempo inteiro. Que não sabia como colocar limites, porque era jovem demais para isso.</w:t>
+        <w:t>Anos depois, Sandy contaria que se sentia vigiada e cobrada o tempo inteiro. Que não sabia como colocar limites, porque era jovem demais para isso.</w:t>
       </w:r>
     </w:p>
     <w:p>
@@ -455,7 +455,7 @@
         <w:rPr>
           <w:color w:val="C00000"/>
         </w:rPr>
-        <w:t>Pense num número. Catorze. Esse número diz muito sobre o que Sandy viveu naqueles anos. E ele vai voltar nesta história de um jeito que ninguém imagina.</w:t>
+        <w:t>Pense num número. Catorze. Esse número já apareceu nesta história, na idade de uma menina diante de uma pergunta cruel. Agora ele volta de outro jeito.</w:t>
       </w:r>
     </w:p>
     <w:p>
@@ -487,7 +487,7 @@
         <w:rPr>
           <w:color w:val="000000"/>
         </w:rPr>
-        <w:t>Ela andava pela rua e via o próprio rosto em todas as bancas. E sabia que, dentro de quase todas aquelas revistas, havia alguém falando da vida íntima dela.</w:t>
+        <w:t>O rosto dela estava em todas as bancas. E a pergunta sobre a virgindade dela continuava aparecendo nas entrevistas.</w:t>
       </w:r>
     </w:p>
     <w:p>
@@ -527,7 +527,7 @@
         <w:rPr>
           <w:color w:val="000000"/>
         </w:rPr>
-        <w:t>E Junior estava ali o tempo inteiro. Do lado da irmã, no palco, na série, nas capas.</w:t>
+        <w:t>E Junior estava ali o tempo inteiro. Do lado da irmã, no palco e na série.</w:t>
       </w:r>
     </w:p>
     <w:p>

</xml_diff>

<commit_message>
Sandy & Junior: revisão da Parte 2
Co-Authored-By: Claude Opus 5.5 <noreply@anthropic.com>
Claude-Session: https://claude.ai/code/session_01MJjUEEZrxQDEUifKK2vj9g
</commit_message>
<xml_diff>
--- a/roteiros/sandy-junior/SJ_Parte2.docx
+++ b/roteiros/sandy-junior/SJ_Parte2.docx
@@ -79,7 +79,7 @@
         <w:rPr>
           <w:color w:val="000000"/>
         </w:rPr>
-        <w:t>A gravadora passou a cercar as crianças de seguranças. Ninguém chegava perto sem autorização.</w:t>
+        <w:t>A gravadora passou a cercar as crianças de seguranças. Para chegar perto deles, era preciso autorização.</w:t>
       </w:r>
     </w:p>
     <w:p>
@@ -303,7 +303,7 @@
         <w:rPr>
           <w:color w:val="000000"/>
         </w:rPr>
-        <w:t>Em programas de auditório e em revistas. A vida íntima de uma adolescente virou assunto de interesse nacional.</w:t>
+        <w:t>Em outras entrevistas, por outras pessoas. A vida íntima de uma adolescente virou assunto de interesse nacional.</w:t>
       </w:r>
     </w:p>
     <w:p>
@@ -407,7 +407,7 @@
         <w:rPr>
           <w:color w:val="000000"/>
         </w:rPr>
-        <w:t>Agora, além de cantar, os dois passavam a semana gravando. A vida real e a vida da série se misturavam. A escola de mentira ficava na mesma cidade da escola de verdade.</w:t>
+        <w:t>Agora, além de cantar, os dois gravavam uma série de televisão. A vida real e a vida da série se misturavam. A escola de mentira ficava na mesma cidade da escola de verdade.</w:t>
       </w:r>
     </w:p>
     <w:p>
@@ -471,14 +471,6 @@
         <w:rPr>
           <w:color w:val="000000"/>
         </w:rPr>
-        <w:t>Catorze capas nas bancas do país, na mesma semana.</w:t>
-      </w:r>
-    </w:p>
-    <w:p>
-      <w:r>
-        <w:rPr>
-          <w:color w:val="000000"/>
-        </w:rPr>
         <w:t>Para qualquer artista, seria um sonho. Para uma adolescente que já se sentia vigiada, era uma parede inteira de olhos.</w:t>
       </w:r>
     </w:p>
@@ -487,7 +479,7 @@
         <w:rPr>
           <w:color w:val="000000"/>
         </w:rPr>
-        <w:t>O rosto dela estava em todas as bancas. E a pergunta sobre a virgindade dela continuava aparecendo nas entrevistas.</w:t>
+        <w:t>Cada capa era mais uma vitrine para a vida que ela tentava esconder.</w:t>
       </w:r>
     </w:p>
     <w:p>
@@ -511,7 +503,7 @@
         <w:rPr>
           <w:color w:val="000000"/>
         </w:rPr>
-        <w:t>Em aeroportos, fãs chegavam a puxar o cabelo de Sandy para conseguir um pedaço de atenção. Nos shows, havia quem tentasse invadir o palco.</w:t>
+        <w:t>Num aeroporto, Sandy chegou a ter o cabelo puxado por fãs que disputavam um pedaço de atenção. Nos shows, havia quem tentasse invadir o palco.</w:t>
       </w:r>
     </w:p>
     <w:p>

</xml_diff>